<commit_message>
Rebuild Russian template manifest
</commit_message>
<xml_diff>
--- a/document_templates/russian_library/Договоры/шаблон_Договор_купли-продажи_квартиры.docx
+++ b/document_templates/russian_library/Договоры/шаблон_Договор_купли-продажи_квартиры.docx
@@ -62,13 +62,12 @@
         </w:rPr>
         <w:t>. </w:t>
       </w:r>
-      <w:proofErr w:type="gramStart"/>
-      <w:r>
-        <w:rPr>
-          <w:rFonts w:ascii="Times New Roman" w:hAnsi="Times New Roman"/>
-          <w:lang w:val="en-US"/>
-        </w:rPr>
-        <w:t>{{ city_w_t_w_r_w_prooferr_w_type_gramend_w_r_w_rsidr_00394192_w_rsidrpr_00394192_w_rpr_w_rfonts_w_ascii_times_new_roman_w_hansi_times_new_roman_w_lang_w_val_en_us_w_rpr_w_t_xml_space_preserve }}</w:t>
+      <w:r>
+        <w:rPr>
+          <w:rFonts w:ascii="Times New Roman" w:hAnsi="Times New Roman"/>
+          <w:lang w:val="en-US"/>
+        </w:rPr>
+        <w:t>{{ city }}</w:t>
       </w:r>
       <w:r>
         <w:rPr>
@@ -103,7 +102,7 @@
           <w:rFonts w:ascii="Times New Roman" w:hAnsi="Times New Roman"/>
           <w:lang w:val="en-US"/>
         </w:rPr>
-        <w:t xml:space="preserve">«{{ w_t_w_r_w_prooferr_w_type_spellstart_w_r_w_rsidr_00394192_w_rsidrpr_00394192_w_rpr_w_rfonts_w_ascii_times_new_roman_w_hansi_times_new_roman_w_lang_w_val_en_us_w_rpr_w_t_date_day_w_t_w_r_w_prooferr_w_type_spellend_w_r_w_rsidr_00394192_w_rsidrpr_00394192_w_rpr_w_rfonts_w_ascii_times_new_roman_w_hansi_times_new_roman_w_lang_w_val_en_us_w_rpr_w_t_xml_space_preserve }}» {{ w_t_w_r_w_prooferr_w_type_spellstart_w_r_w_rsidr_00394192_w_rsidrpr_00394192_w_rpr_w_rfonts_w_ascii_times_new_roman_w_hansi_times_new_roman_w_lang_w_val_en_us_w_rpr_w_t_date_month_w_t_w_r_w_prooferr_w_type_spellend_w_r_w_rsidr_00394192_w_rsidrpr_00394192_w_rpr_w_rfonts_w_ascii_times_new_roman_w_hansi_times_new_roman_w_lang_w_val_en_us_w_rpr_w_t_xml_space_preserve }} {{ w_t_w_r_w_prooferr_w_type_spellstart_w_r_w_rsidr_00394192_w_rsidrpr_00394192_w_rpr_w_rfonts_w_ascii_times_new_roman_w_hansi_times_new_roman_w_lang_w_val_en_us_w_rpr_w_t_date_year_w_t_w_r_w_prooferr_w_type_spellend_w_r_w_rsidr_00394192_w_rsidrpr_00394192_w_rpr_w_rfonts_w_ascii_times_new_roman_w_hansi_times_new_roman_w_lang_w_val_en_us_w_rpr_w_t_xml_space_preserve }} </w:t>
+        <w:t xml:space="preserve">«{{ date_day }}» {{ date_month }} {{ date_year }} </w:t>
       </w:r>
       <w:r>
         <w:rPr>
@@ -159,13 +158,12 @@
         </w:rPr>
         <w:t xml:space="preserve">. </w:t>
       </w:r>
-      <w:proofErr w:type="gramStart"/>
-      <w:r>
-        <w:rPr>
-          <w:rFonts w:ascii="Times New Roman" w:hAnsi="Times New Roman"/>
-          <w:lang w:val="en-US"/>
-        </w:rPr>
-        <w:t xml:space="preserve">{{ w_t_w_r_w_prooferr_w_type_spellstart_w_r_w_rsidr_00394192_w_rsidrpr_00394192_w_rpr_w_rfonts_w_ascii_times_new_roman_w_hansi_times_new_roman_w_lang_w_val_en_us_w_rpr_w_t_citizenship_w_t_w_r_w_prooferr_w_type_gramend_w_r_w_rsidr_00394192_w_rsidrpr_00394192_w_rpr_w_rfonts_w_ascii_times_new_roman_w_hansi_times_new_roman_w_lang_w_val_en_us_w_rpr_w_t_of_the_w_t_w_r_w_r_w_rsidr_00394192_w_rsidrpr_00394192_w_rpr_w_rfonts_w_ascii_times_new_roman_w_hansi_times_new_roman_w_lang_w_val_en_us_w_rpr_w_t_seller_w_t_w_r_w_prooferr_w_type_spellend_w_r_w_rsidr_00394192_w_rpr_w_rfonts_w_ascii_times_new_roman_w_hansi_times_new_roman_w_lang_w_val_en_us_w_rpr_w_t_xml_space_preserve }} {{ w_t_w_r_w_prooferr_w_type_spellstart_w_r_w_rsidr_00394192_w_rpr_w_rfonts_w_ascii_times_new_roman_w_hansi_times_new_roman_w_lang_w_val_en_us_w_rpr_w_t_full_name_of_the_w_t_w_r_w_r_w_rsidr_00394192_w_rsidrpr_00394192_w_rpr_w_rfonts_w_ascii_times_new_roman_w_hansi_times_new_roman_w_lang_w_val_en_us_w_rpr_w_t_seller_w_t_w_r_w_prooferr_w_type_spellend_w_r_w_rsidr_00394192_w_rsidrpr_00394192_w_rpr_w_rfonts_w_ascii_times_new_roman_w_hansi_times_new_roman_w_lang_w_val_en_us_w_rpr_w_t_xml_space_preserve }}, {{ w_t_w_r_w_prooferr_w_type_spellstart_w_r_w_rsidr_00394192_w_rsidrpr_00394192_w_rpr_w_rfonts_w_ascii_times_new_roman_w_hansi_times_new_roman_w_lang_w_val_en_us_w_rpr_w_t_date_of_birth_of_the_w_t_w_r_w_r_w_rsidr_00394192_w_rpr_w_rfonts_w_ascii_times_new_roman_w_hansi_times_new_roman_w_lang_w_val_en_us_w_rpr_w_t_w_t_w_r_w_r_w_rsidr_00394192_w_rsidrpr_00394192_w_rpr_w_rfonts_w_ascii_times_new_roman_w_hansi_times_new_roman_w_lang_w_val_en_us_w_rpr_w_t_seller_w_t_w_r_w_prooferr_w_type_spellend_w_r_w_rsidr_00394192_w_rsidrpr_00394192_w_rpr_w_rfonts_w_ascii_times_new_roman_w_hansi_times_new_roman_w_lang_w_val_en_us_w_rpr_w_t_xml_space_preserve }} </w:t>
+      <w:r>
+        <w:rPr>
+          <w:rFonts w:ascii="Times New Roman" w:hAnsi="Times New Roman"/>
+          <w:lang w:val="en-US"/>
+        </w:rPr>
+        <w:t xml:space="preserve">{{ citizenship_of_the_seller }} {{ full_name_of_the_seller }}, {{ date_of_birth_of_the_seller }} </w:t>
       </w:r>
       <w:r>
         <w:rPr>
@@ -217,7 +215,7 @@
           <w:rFonts w:ascii="Times New Roman" w:hAnsi="Times New Roman"/>
           <w:lang w:val="en-US"/>
         </w:rPr>
-        <w:t xml:space="preserve"> {{ w_t_w_r_w_prooferr_w_type_spellstart_w_r_w_rsidr_00394192_w_rsidrpr_00394192_w_rpr_w_rfonts_w_ascii_times_new_roman_w_hansi_times_new_roman_w_lang_w_val_en_us_w_rpr_w_t_passport_series_of_the_w_t_w_r_w_r_w_rsidr_00394192_w_rpr_w_rfonts_w_ascii_times_new_roman_w_hansi_times_new_roman_w_lang_w_val_en_us_w_rpr_w_t_w_t_w_r_w_r_w_rsidr_00394192_w_rsidrpr_00394192_w_rpr_w_rfonts_w_ascii_times_new_roman_w_hansi_times_new_roman_w_lang_w_val_en_us_w_rpr_w_t_seller_w_t_w_r_w_prooferr_w_type_spellend_w_r_w_rsidr_00394192_w_rsidrpr_00394192_w_rpr_w_rfonts_w_ascii_times_new_roman_w_hansi_times_new_roman_w_lang_w_val_en_us_w_rpr_w_t_xml_space_preserve }} {{ w_t_w_r_w_prooferr_w_type_spellstart_w_r_w_rsidr_00394192_w_rsidrpr_00394192_w_rpr_w_rfonts_w_ascii_times_new_roman_w_hansi_times_new_roman_w_lang_w_val_en_us_w_rpr_w_t_passport_number_of_the_w_t_w_r_w_r_w_rsidr_00394192_w_rpr_w_rfonts_w_ascii_times_new_roman_w_hansi_times_new_roman_w_lang_w_val_en_us_w_rpr_w_t_w_t_w_r_w_r_w_rsidr_00394192_w_rsidrpr_00394192_w_rpr_w_rfonts_w_ascii_times_new_roman_w_hansi_times_new_roman_w_lang_w_val_en_us_w_rpr_w_t_seller_w_t_w_r_w_prooferr_w_type_spellend_w_r_w_rsidr_00394192_w_rsidrpr_00394192_w_rpr_w_rfonts_w_ascii_times_new_roman_w_hansi_times_new_roman_w_lang_w_val_en_us_w_rpr_w_t_xml_space_preserve }} </w:t>
+        <w:t xml:space="preserve"> {{ passport_series_of_the_seller }} {{ passport_number_of_the_seller }} </w:t>
       </w:r>
       <w:r>
         <w:rPr>
@@ -230,7 +228,7 @@
           <w:rFonts w:ascii="Times New Roman" w:hAnsi="Times New Roman"/>
           <w:lang w:val="en-US"/>
         </w:rPr>
-        <w:t xml:space="preserve"> {{ w_t_w_r_w_prooferr_w_type_spellstart_w_r_w_rsidr_00394192_w_rsidrpr_00394192_w_rpr_w_rfonts_w_ascii_times_new_roman_w_hansi_times_new_roman_w_lang_w_val_en_us_w_rpr_w_t_date_of_issue_of_the_passport_of_the_w_t_w_r_w_r_w_rsidr_00394192_w_rpr_w_rfonts_w_ascii_times_new_roman_w_hansi_times_new_roman_w_lang_w_val_en_us_w_rpr_w_t_w_t_w_r_w_r_w_rsidr_00394192_w_rsidrpr_00394192_w_rpr_w_rfonts_w_ascii_times_new_roman_w_hansi_times_new_roman_w_lang_w_val_en_us_w_rpr_w_t_seller_w_t_w_r_w_prooferr_w_type_spellend_w_r_w_rsidr_00394192_w_rsidrpr_00394192_w_rpr_w_rfonts_w_ascii_times_new_roman_w_hansi_times_new_roman_w_lang_w_val_en_us_w_rpr_w_t_xml_space_preserve }} {{ w_t_w_r_w_prooferr_w_type_spellstart_w_r_w_rsidr_00394192_w_rsidrpr_00394192_w_rpr_w_rfonts_w_ascii_times_new_roman_w_hansi_times_new_roman_w_lang_w_val_en_us_w_rpr_w_t_who_issued_the_passport_of_the_w_t_w_r_w_r_w_rsidr_00394192_w_rpr_w_rfonts_w_ascii_times_new_roman_w_hansi_times_new_roman_w_lang_w_val_en_us_w_rpr_w_t_w_t_w_r_w_r_w_rsidr_00394192_w_rsidrpr_00394192_w_rpr_w_rfonts_w_ascii_times_new_roman_w_hansi_times_new_roman_w_lang_w_val_en_us_w_rpr_w_t_seller_w_t_w_r_w_prooferr_w_type_spellend_w_r_w_rsidr_00394192_w_rsidrpr_00394192_w_rpr_w_rfonts_w_ascii_times_new_roman_w_hansi_times_new_roman_w_lang_w_val_en_us_w_rpr_w_t_xml_space_preserve }}, </w:t>
+        <w:t xml:space="preserve"> {{ date_of_issue_of_the_passport_of_the_seller }} {{ who_issued_the_passport_of_the_seller }}, </w:t>
       </w:r>
       <w:r>
         <w:rPr>
@@ -282,7 +280,7 @@
           <w:rFonts w:ascii="Times New Roman" w:hAnsi="Times New Roman"/>
           <w:lang w:val="en-US"/>
         </w:rPr>
-        <w:t xml:space="preserve">: {{ w_t_w_r_w_prooferr_w_type_spellstart_w_r_w_rsidr_00394192_w_rsidrpr_00394192_w_rpr_w_rfonts_w_ascii_times_new_roman_w_hansi_times_new_roman_w_lang_w_val_en_us_w_rpr_w_t_registration_address_of_the_w_t_w_r_w_r_w_rsidr_00394192_w_rpr_w_rfonts_w_ascii_times_new_roman_w_hansi_times_new_roman_w_lang_w_val_en_us_w_rpr_w_t_w_t_w_r_w_r_w_rsidr_00394192_w_rsidrpr_00394192_w_rpr_w_rfonts_w_ascii_times_new_roman_w_hansi_times_new_roman_w_lang_w_val_en_us_w_rpr_w_t_seller_w_t_w_r_w_prooferr_w_type_spellend_w_r_w_rsidr_00394192_w_rsidrpr_00394192_w_rpr_w_rfonts_w_ascii_times_new_roman_w_hansi_times_new_roman_w_lang_w_val_en_us_w_rpr_w_t_xml_space_preserve }}, </w:t>
+        <w:t xml:space="preserve">: {{ registration_address_of_the_seller }}, </w:t>
       </w:r>
       <w:r>
         <w:rPr>
@@ -297,14 +295,12 @@
         </w:rPr>
         <w:t>(-</w:t>
       </w:r>
-      <w:proofErr w:type="spellStart"/>
       <w:r>
         <w:rPr>
           <w:rFonts w:ascii="Times New Roman" w:hAnsi="Times New Roman"/>
         </w:rPr>
         <w:t>ая</w:t>
       </w:r>
-      <w:proofErr w:type="spellEnd"/>
       <w:r>
         <w:rPr>
           <w:rFonts w:ascii="Times New Roman" w:hAnsi="Times New Roman"/>
@@ -402,16 +398,14 @@
         <w:rPr>
           <w:rFonts w:ascii="Times New Roman" w:hAnsi="Times New Roman"/>
         </w:rPr>
-        <w:t xml:space="preserve">и Гр. {{ w_t_w_r_w_prooferr_w_type_spellstart_w_r_w_rsidrpr_00394192_w_rpr_w_rfonts_w_ascii_times_new_roman_w_hansi_times_new_roman_w_rpr_w_t_citizenship_of_the_w_t_w_r_w_r_w_rsidrpr_00394192_w_rpr_w_rfonts_w_ascii_times_new_roman_w_hansi_times_new_roman_w_rpr_w_t_buyer_w_t_w_r_w_prooferr_w_type_spellend_w_r_w_rsidrpr_00394192_w_rpr_w_rfonts_w_ascii_times_new_roman_w_hansi_times_new_roman_w_rpr_w_t_xml_space_preserve }} {{ w_t_w_r_w_prooferr_w_type_spellstart_w_r_w_rsidrpr_00394192_w_rpr_w_rfonts_w_ascii_times_new_roman_w_hansi_times_new_roman_w_rpr_w_t_full_name_of_the_buyer_w_t_w_r_w_prooferr_w_type_spellend_w_r_w_rsidrpr_00394192_w_rpr_w_rfonts_w_ascii_times_new_roman_w_hansi_times_new_roman_w_rpr_w_t_xml_space_preserve }}, {{ w_t_w_r_w_prooferr_w_type_spellstart_w_r_w_rsidrpr_00394192_w_rpr_w_rfonts_w_ascii_times_new_roman_w_hansi_times_new_roman_w_rpr_w_t_date_of_birth_of_the_buyer_w_t_w_r_w_prooferr_w_type_spellend_w_r_w_rsidrpr_00394192_w_rpr_w_rfonts_w_ascii_times_new_roman_w_hansi_times_new_roman_w_rpr_w_t_xml_space_preserve }} года рождения, паспорт гражданина {{ w_t_w_r_w_prooferr_w_type_spellstart_w_r_w_rsidrpr_00394192_w_rpr_w_rfonts_w_ascii_times_new_roman_w_hansi_times_new_roman_w_rpr_w_t_passport_series_of_the_buyer_w_t_w_r_w_prooferr_w_type_spellend_w_r_w_rsidrpr_00394192_w_rpr_w_rfonts_w_ascii_times_new_roman_w_hansi_times_new_roman_w_rpr_w_t_xml_space_preserve }} {{ w_t_w_r_w_prooferr_w_type_spellstart_w_r_w_rsidrpr_00394192_w_rpr_w_rfonts_w_ascii_times_new_roman_w_hansi_times_new_roman_w_rpr_w_t_passport_number_of_the_buyer_w_t_w_r_w_prooferr_w_type_spellend_w_r_w_rsidrpr_00394192_w_rpr_w_rfonts_w_ascii_times_new_roman_w_hansi_times_new_roman_w_rpr_w_t_xml_space_preserve }} выдан {{ w_t_w_r_w_prooferr_w_type_spellstart_w_r_w_rsidrpr_00394192_w_rpr_w_rfonts_w_ascii_times_new_roman_w_hansi_times_new_roman_w_rpr_w_t_date_of_issue_of_the_passport_of_the_buyer_w_t_w_r_w_prooferr_w_type_spellend_w_r_w_rsidrpr_00394192_w_rpr_w_rfonts_w_ascii_times_new_roman_w_hansi_times_new_roman_w_rpr_w_t_xml_space_preserve }} {{ w_t_w_r_w_prooferr_w_type_spellstart_w_r_w_rsidrpr_00394192_w_rpr_w_rfonts_w_ascii_times_new_roman_w_hansi_times_new_roman_w_rpr_w_t_who_issued_the_passport_of_the_buyer_w_t_w_r_w_prooferr_w_type_spellend_w_r_w_rsidrpr_00394192_w_rpr_w_rfonts_w_ascii_times_new_roman_w_hansi_times_new_roman_w_rpr_w_t_xml_space_preserve }}, зарегистрирован(-а) по адресу: {{ w_t_w_r_w_prooferr_w_type_spellstart_w_r_w_rsidrpr_00394192_w_rpr_w_rfonts_w_ascii_times_new_roman_w_hansi_times_new_roman_w_rpr_w_t_registration_address_of_the_buyer_w_t_w_r_w_prooferr_w_type_spellend_w_r_w_rsidrpr_00394192_w_rpr_w_rfonts_w_ascii_times_new_roman_w_hansi_times_new_roman_w_rpr_w_t_xml_space_preserve }}, именуемый(-</w:t>
-      </w:r>
-      <w:proofErr w:type="spellStart"/>
+        <w:t xml:space="preserve">и Гр. {{ citizenship_of_the_buyer }} {{ full_name_of_the_buyer }}, {{ date_of_birth_of_the_buyer }} года рождения, паспорт гражданина {{ passport_series_of_the_buyer }} {{ passport_number_of_the_buyer }} выдан {{ date_of_issue_of_the_passport_of_the_buyer }} {{ who_issued_the_passport_of_the_buyer }}, зарегистрирован(-а) по адресу: {{ registration_address_of_the_buyer }}, именуемый(-</w:t>
+      </w:r>
       <w:r>
         <w:rPr>
           <w:rFonts w:ascii="Times New Roman" w:hAnsi="Times New Roman"/>
         </w:rPr>
         <w:t>ая</w:t>
       </w:r>
-      <w:proofErr w:type="spellEnd"/>
       <w:r>
         <w:rPr>
           <w:rFonts w:ascii="Times New Roman" w:hAnsi="Times New Roman"/>
@@ -483,12 +477,11 @@
         </w:rPr>
         <w:t xml:space="preserve">Покупатель приобретает в собственность жилое помещение - квартиру, расположенную по адресу: </w:t>
       </w:r>
-      <w:proofErr w:type="gramStart"/>
-      <w:r>
-        <w:rPr>
-          <w:rFonts w:ascii="Times New Roman" w:hAnsi="Times New Roman"/>
-        </w:rPr>
-        <w:t xml:space="preserve">{{ w_t_w_r_w_r_w_rsidr_00376ff5_w_rpr_w_rfonts_w_ascii_times_new_roman_w_hansi_times_new_roman_w_lang_w_val_en_us_w_rpr_w_t_flat_w_t_w_r_w_prooferr_w_type_gramend_w_r_w_rsidr_00376ff5_w_rsidrpr_00376ff5_w_rpr_w_rfonts_w_ascii_times_new_roman_w_hansi_times_new_roman_w_rpr_w_t_w_t_w_r_w_r_w_rsidr_00376ff5_w_rpr_w_rfonts_w_ascii_times_new_roman_w_hansi_times_new_roman_w_lang_w_val_en_us_w_rpr_w_t_address_w_t_w_r_w_r_w_rsidr_00394192_w_rsidrpr_00394192_w_rpr_w_rfonts_w_ascii_times_new_roman_w_hansi_times_new_roman_w_rpr_w_t_xml_space_preserve }}</w:t>
+      <w:r>
+        <w:rPr>
+          <w:rFonts w:ascii="Times New Roman" w:hAnsi="Times New Roman"/>
+        </w:rPr>
+        <w:t xml:space="preserve">{{ flat_address }}</w:t>
       </w:r>
       <w:r>
         <w:rPr>
@@ -512,12 +505,11 @@
         </w:rPr>
         <w:t xml:space="preserve">1.2. Указанная Квартира расположена на </w:t>
       </w:r>
-      <w:proofErr w:type="gramStart"/>
-      <w:r>
-        <w:rPr>
-          <w:rFonts w:ascii="Times New Roman" w:hAnsi="Times New Roman"/>
-        </w:rPr>
-        <w:t xml:space="preserve">{{ w_t_w_r_w_prooferr_w_type_spellstart_w_r_w_rsidr_00394192_w_rsidrpr_00394192_w_rpr_w_rfonts_w_ascii_times_new_roman_w_hansi_times_new_roman_w_rpr_w_t_floor_w_t_w_r_w_prooferr_w_type_spellend_w_prooferr_w_type_gramend_w_r_w_rsidr_00394192_w_rsidrpr_00394192_w_rpr_w_rfonts_w_ascii_times_new_roman_w_hansi_times_new_roman_w_rpr_w_t_xml_space_preserve }}</w:t>
+      <w:r>
+        <w:rPr>
+          <w:rFonts w:ascii="Times New Roman" w:hAnsi="Times New Roman"/>
+        </w:rPr>
+        <w:t xml:space="preserve">{{ floor }}</w:t>
       </w:r>
       <w:r>
         <w:rPr>
@@ -529,7 +521,7 @@
         <w:rPr>
           <w:rFonts w:ascii="Times New Roman" w:hAnsi="Times New Roman"/>
         </w:rPr>
-        <w:t xml:space="preserve">{{ w_t_w_r_w_prooferr_w_type_spellstart_w_r_w_rsidr_009c6e38_w_rpr_w_rfonts_w_ascii_times_new_roman_w_hansi_times_new_roman_w_lang_w_val_en_us_w_rpr_w_t_num_w_t_w_r_w_prooferr_w_type_spellend_w_r_w_rsidr_009c6e38_w_rsidrpr_009c6e38_w_rpr_w_rfonts_w_ascii_times_new_roman_w_hansi_times_new_roman_w_rpr_w_t_w_t_w_r_w_r_w_rsidr_009c6e38_w_rpr_w_rfonts_w_ascii_times_new_roman_w_hansi_times_new_roman_w_lang_w_val_en_us_w_rpr_w_t_of_w_t_w_r_w_r_w_rsidr_009c6e38_w_rsidrpr_009c6e38_w_rpr_w_rfonts_w_ascii_times_new_roman_w_hansi_times_new_roman_w_rpr_w_t_w_t_w_r_w_r_w_rsidr_009c6e38_w_rpr_w_rfonts_w_ascii_times_new_roman_w_hansi_times_new_roman_w_lang_w_val_en_us_w_rpr_w_t_houses_w_t_w_r_w_r_w_rsidr_009c6e38_w_rsidrpr_009c6e38_w_rpr_w_rfonts_w_ascii_times_new_roman_w_hansi_times_new_roman_w_rpr_w_t_w_t_w_r_w_prooferr_w_type_spellstart_w_r_w_rsidr_009c6e38_w_rsidrpr_009c6e38_w_rpr_w_rfonts_w_ascii_times_new_roman_w_hansi_times_new_roman_w_rpr_w_t_floor_w_t_w_r_w_prooferr_w_type_spellend_w_r_w_rsidr_009c6e38_w_rpr_w_rfonts_w_ascii_times_new_roman_w_hansi_times_new_roman_w_lang_w_val_en_us_w_rpr_w_t_s_w_t_w_r_w_r_w_rsidr_009c6e38_w_rsidrpr_009c6e38_w_rpr_w_rfonts_w_ascii_times_new_roman_w_hansi_times_new_roman_w_rpr_w_t_xml_space_preserve }}</w:t>
+        <w:t xml:space="preserve">{{ num_of_houses_floors }}</w:t>
       </w:r>
       <w:r>
         <w:rPr>
@@ -541,7 +533,7 @@
         <w:rPr>
           <w:rFonts w:ascii="Times New Roman" w:hAnsi="Times New Roman"/>
         </w:rPr>
-        <w:t xml:space="preserve">{{ w_t_w_r_w_prooferr_w_type_spellstart_w_r_w_rsidr_009c6e38_w_rpr_w_rfonts_w_ascii_times_new_roman_w_hansi_times_new_roman_w_lang_w_val_en_us_w_rpr_w_t_num_w_t_w_r_w_prooferr_w_type_spellend_w_r_w_rsidr_009c6e38_w_rsidrpr_009c6e38_w_rpr_w_rfonts_w_ascii_times_new_roman_w_hansi_times_new_roman_w_rpr_w_t_w_t_w_r_w_r_w_rsidr_009c6e38_w_rpr_w_rfonts_w_ascii_times_new_roman_w_hansi_times_new_roman_w_lang_w_val_en_us_w_rpr_w_t_of_w_t_w_r_w_r_w_rsidr_009c6e38_w_rsidrpr_009c6e38_w_rpr_w_rfonts_w_ascii_times_new_roman_w_hansi_times_new_roman_w_rpr_w_t_w_t_w_r_w_r_w_rsidr_009c6e38_w_rpr_w_rfonts_w_ascii_times_new_roman_w_hansi_times_new_roman_w_lang_w_val_en_us_w_rpr_w_t_rooms_w_t_w_r_w_r_w_rsidr_009c6e38_w_rsidrpr_009c6e38_w_rpr_w_rfonts_w_ascii_times_new_roman_w_hansi_times_new_roman_w_rpr_w_t_xml_space_preserve }}</w:t>
+        <w:t xml:space="preserve">{{ num_of_rooms }}</w:t>
       </w:r>
       <w:r>
         <w:rPr>
@@ -559,7 +551,7 @@
         <w:rPr>
           <w:rFonts w:ascii="Times New Roman" w:hAnsi="Times New Roman"/>
         </w:rPr>
-        <w:t xml:space="preserve">{{ w_t_w_r_w_prooferr_w_type_spellstart_w_r_w_rsidr_009c6e38_w_rsidrpr_009c6e38_w_rpr_w_rfonts_w_ascii_times_new_roman_w_hansi_times_new_roman_w_rpr_w_t_square_w_t_w_r_w_prooferr_w_type_spellend_w_r_w_rsidr_009c6e38_w_rsidrpr_009c6e38_w_rpr_w_rfonts_w_ascii_times_new_roman_w_hansi_times_new_roman_w_rpr_w_t_xml_space_preserve }}</w:t>
+        <w:t xml:space="preserve">{{ square }}</w:t>
       </w:r>
       <w:r>
         <w:rPr>
@@ -571,7 +563,7 @@
         <w:rPr>
           <w:rFonts w:ascii="Times New Roman" w:hAnsi="Times New Roman"/>
         </w:rPr>
-        <w:t xml:space="preserve">{{ w_t_w_r_w_prooferr_w_type_spellstart_w_r_w_rsidr_009c6e38_w_rpr_w_rfonts_w_ascii_times_new_roman_w_hansi_times_new_roman_w_rpr_w_t_cadastral_w_t_w_r_w_r_w_rsidr_009c6e38_w_rsidrpr_009c6e38_w_rpr_w_rfonts_w_ascii_times_new_roman_w_hansi_times_new_roman_w_rpr_w_t_number_w_t_w_r_w_prooferr_w_type_spellend_w_r_w_rsidr_009c6e38_w_rsidrpr_009c6e38_w_rpr_w_rfonts_w_ascii_times_new_roman_w_hansi_times_new_roman_w_rpr_w_t_xml_space_preserve }}</w:t>
+        <w:t xml:space="preserve">{{ cadastral_number }}</w:t>
       </w:r>
       <w:r>
         <w:rPr>
@@ -595,12 +587,11 @@
         </w:rPr>
         <w:t xml:space="preserve">1.3. Отчуждаемая по Договору Квартира принадлежит Продавцу на праве собственности на основании </w:t>
       </w:r>
-      <w:proofErr w:type="gramStart"/>
-      <w:r>
-        <w:rPr>
-          <w:rFonts w:ascii="Times New Roman" w:hAnsi="Times New Roman"/>
-        </w:rPr>
-        <w:t xml:space="preserve">{{ w_t_w_r_w_prooferr_w_type_spellstart_w_r_w_rsidr_009c6e38_w_rsidrpr_009c6e38_w_rpr_w_rfonts_w_ascii_times_new_roman_w_hansi_times_new_roman_w_rpr_w_t_the_w_t_w_r_w_prooferr_w_type_gramend_w_r_w_rsidr_009c6e38_w_rsidrpr_009c6e38_w_rpr_w_rfonts_w_ascii_times_new_roman_w_hansi_times_new_roman_w_rpr_w_t_basis_of_ownership_of_residential_premises_to_the_landlord_w_t_w_r_w_prooferr_w_type_spellend_w_r_w_rsidr_009c6e38_w_rsidrpr_009c6e38_w_rpr_w_rfonts_w_ascii_times_new_roman_w_hansi_times_new_roman_w_rpr_w_t_xml_space_preserve }}</w:t>
+      <w:r>
+        <w:rPr>
+          <w:rFonts w:ascii="Times New Roman" w:hAnsi="Times New Roman"/>
+        </w:rPr>
+        <w:t xml:space="preserve">{{ the_basis_of_ownership_of_residential_premises_to_the_landlord }}</w:t>
       </w:r>
       <w:r>
         <w:rPr>
@@ -618,7 +609,7 @@
         <w:rPr>
           <w:rFonts w:ascii="Times New Roman" w:hAnsi="Times New Roman"/>
         </w:rPr>
-        <w:t xml:space="preserve">«{{ w_t_w_r_w_prooferr_w_type_spellstart_w_r_w_rsidr_009c6e38_w_rsidrpr_009c6e38_w_rpr_w_rfonts_w_ascii_times_new_roman_w_hansi_times_new_roman_w_rpr_w_t_date_day_w_t_w_r_w_prooferr_w_type_spellend_w_r_w_rsidr_009c6e38_w_rsidrpr_009c6e38_w_rpr_w_rfonts_w_ascii_times_new_roman_w_hansi_times_new_roman_w_rpr_w_t_w_t_w_r_w_r_w_rsidr_009c6e38_w_rpr_w_rfonts_w_ascii_times_new_roman_w_hansi_times_new_roman_w_lang_w_val_en_us_w_rpr_w_t_of_w_t_w_r_w_r_w_rsidr_009c6e38_w_rsidrpr_009c6e38_w_rpr_w_rfonts_w_ascii_times_new_roman_w_hansi_times_new_roman_w_rpr_w_t_w_t_w_r_w_r_w_rsidr_009c6e38_w_rpr_w_rfonts_w_ascii_times_new_roman_w_hansi_times_new_roman_w_lang_w_val_en_us_w_rpr_w_t_registration_w_t_w_r_w_r_w_rsidr_009c6e38_w_rsidrpr_009c6e38_w_rpr_w_rfonts_w_ascii_times_new_roman_w_hansi_times_new_roman_w_rpr_w_t_xml_space_preserve }}» {{ w_t_w_r_w_prooferr_w_type_spellstart_w_r_w_rsidr_009c6e38_w_rsidrpr_009c6e38_w_rpr_w_rfonts_w_ascii_times_new_roman_w_hansi_times_new_roman_w_rpr_w_t_date_month_w_t_w_r_w_prooferr_w_type_spellend_w_r_w_rsidr_009c6e38_w_rsidrpr_009c6e38_w_rpr_w_rfonts_w_ascii_times_new_roman_w_hansi_times_new_roman_w_rpr_w_t_w_t_w_r_w_r_w_rsidr_009c6e38_w_rpr_w_rfonts_w_ascii_times_new_roman_w_hansi_times_new_roman_w_lang_w_val_en_us_w_rpr_w_t_of_w_t_w_r_w_r_w_rsidr_009c6e38_w_rsidrpr_009c6e38_w_rpr_w_rfonts_w_ascii_times_new_roman_w_hansi_times_new_roman_w_rpr_w_t_w_t_w_r_w_r_w_rsidr_009c6e38_w_rpr_w_rfonts_w_ascii_times_new_roman_w_hansi_times_new_roman_w_lang_w_val_en_us_w_rpr_w_t_registration_w_t_w_r_w_r_w_rsidr_009c6e38_w_rsidrpr_009c6e38_w_rpr_w_rfonts_w_ascii_times_new_roman_w_hansi_times_new_roman_w_rpr_w_t_xml_space_preserve }} {{ w_t_w_r_w_prooferr_w_type_spellstart_w_r_w_rsidr_009c6e38_w_rsidrpr_009c6e38_w_rpr_w_rfonts_w_ascii_times_new_roman_w_hansi_times_new_roman_w_rpr_w_t_date_year_w_t_w_r_w_prooferr_w_type_spellend_w_r_w_rsidr_009c6e38_w_rsidrpr_009c6e38_w_rpr_w_rfonts_w_ascii_times_new_roman_w_hansi_times_new_roman_w_rpr_w_t_w_t_w_r_w_r_w_rsidr_009c6e38_w_rpr_w_rfonts_w_ascii_times_new_roman_w_hansi_times_new_roman_w_lang_w_val_en_us_w_rpr_w_t_of_w_t_w_r_w_r_w_rsidr_009c6e38_w_rsidrpr_009c6e38_w_rpr_w_rfonts_w_ascii_times_new_roman_w_hansi_times_new_roman_w_rpr_w_t_w_t_w_r_w_r_w_rsidr_009c6e38_w_rpr_w_rfonts_w_ascii_times_new_roman_w_hansi_times_new_roman_w_lang_w_val_en_us_w_rpr_w_t_registration_w_t_w_r_w_r_w_rsidr_009c6e38_w_rsidrpr_009c6e38_w_rpr_w_rfonts_w_ascii_times_new_roman_w_hansi_times_new_roman_w_rpr_w_t_xml_space_preserve }} г.</w:t>
+        <w:t xml:space="preserve">«{{ date_day_of_registration }}» {{ date_month_of_registration }} {{ date_year_of_registration }} г.</w:t>
       </w:r>
       <w:r>
         <w:rPr>
@@ -630,7 +621,7 @@
         <w:rPr>
           <w:rFonts w:ascii="Times New Roman" w:hAnsi="Times New Roman"/>
         </w:rPr>
-        <w:t xml:space="preserve">{{ w_t_w_r_w_prooferr_w_type_spellstart_w_r_w_rsidr_009c6e38_w_rpr_w_rfonts_w_ascii_times_new_roman_w_hansi_times_new_roman_w_lang_w_val_en_us_w_rpr_w_t_num_w_t_w_r_w_prooferr_w_type_spellend_w_r_w_rsidr_009c6e38_w_rsidrpr_009c6e38_w_rpr_w_rfonts_w_ascii_times_new_roman_w_hansi_times_new_roman_w_rpr_w_t_w_t_w_r_w_r_w_rsidr_009c6e38_w_rpr_w_rfonts_w_ascii_times_new_roman_w_hansi_times_new_roman_w_lang_w_val_en_us_w_rpr_w_t_of_w_t_w_r_w_r_w_rsidr_009c6e38_w_rsidrpr_009c6e38_w_rpr_w_rfonts_w_ascii_times_new_roman_w_hansi_times_new_roman_w_rpr_w_t_w_t_w_r_w_r_w_rsidr_009c6e38_w_rpr_w_rfonts_w_ascii_times_new_roman_w_hansi_times_new_roman_w_lang_w_val_en_us_w_rpr_w_t_registration_w_t_w_r_w_r_w_rsidr_009c6e38_w_rsidrpr_009c6e38_w_rpr_w_rfonts_w_ascii_times_new_roman_w_hansi_times_new_roman_w_rpr_w_t_w_t_w_r_w_r_w_rsidr_009c6e38_w_rpr_w_rfonts_w_ascii_times_new_roman_w_hansi_times_new_roman_w_lang_w_val_en_us_w_rpr_w_t_doc_w_t_w_r_w_r_w_rsidr_009c6e38_w_rsidrpr_009c6e38_w_rpr_w_rfonts_w_ascii_times_new_roman_w_hansi_times_new_roman_w_rpr_w_t_xml_space_preserve }}</w:t>
+        <w:t xml:space="preserve">{{ num_of_registration_doc }}</w:t>
       </w:r>
       <w:r>
         <w:rPr>
@@ -707,13 +698,12 @@
         </w:rPr>
         <w:t xml:space="preserve">1.6. На момент заключения Договора в квартире </w:t>
       </w:r>
-      <w:proofErr w:type="gramStart"/>
-      <w:r>
-        <w:rPr>
-          <w:rFonts w:ascii="Times New Roman" w:hAnsi="Times New Roman" w:cs="Times New Roman"/>
-          <w:sz w:val="22"/>
-        </w:rPr>
-        <w:t xml:space="preserve">{{ w_t_w_r_w_r_w_rsidr_007c0711_w_rpr_w_rfonts_w_ascii_times_new_roman_w_hansi_times_new_roman_w_cs_times_new_roman_w_sz_w_val_22_w_lang_w_val_en_us_w_rpr_w_t_who_w_t_w_r_w_prooferr_w_type_gramend_w_r_w_rsidr_007c0711_w_rsidrpr_007c0711_w_rpr_w_rfonts_w_ascii_times_new_roman_w_hansi_times_new_roman_w_cs_times_new_roman_w_sz_w_val_22_w_rpr_w_t_w_t_w_r_w_r_w_rsidr_007c0711_w_rpr_w_rfonts_w_ascii_times_new_roman_w_hansi_times_new_roman_w_cs_times_new_roman_w_sz_w_val_22_w_lang_w_val_en_us_w_rpr_w_t_lives_w_t_w_r_w_r_w_rsidr_007c0711_w_rsidrpr_007c0711_w_rpr_w_rfonts_w_ascii_times_new_roman_w_hansi_times_new_roman_w_cs_times_new_roman_w_sz_w_val_22_w_rpr_w_t_w_t_w_r_w_r_w_rsidr_007c0711_w_rpr_w_rfonts_w_ascii_times_new_roman_w_hansi_times_new_roman_w_cs_times_new_roman_w_sz_w_val_22_w_lang_w_val_en_us_w_rpr_w_t_and_w_t_w_r_w_r_w_rsidr_007c0711_w_rsidrpr_007c0711_w_rpr_w_rfonts_w_ascii_times_new_roman_w_hansi_times_new_roman_w_cs_times_new_roman_w_sz_w_val_22_w_rpr_w_t_w_t_w_r_w_r_w_rsidr_007c0711_w_rpr_w_rfonts_w_ascii_times_new_roman_w_hansi_times_new_roman_w_cs_times_new_roman_w_sz_w_val_22_w_lang_w_val_en_us_w_rpr_w_t_is_w_t_w_r_w_r_w_rsidr_007c0711_w_rsidrpr_007c0711_w_rpr_w_rfonts_w_ascii_times_new_roman_w_hansi_times_new_roman_w_cs_times_new_roman_w_sz_w_val_22_w_rpr_w_t_w_t_w_r_w_r_w_rsidr_007c0711_w_rpr_w_rfonts_w_ascii_times_new_roman_w_hansi_times_new_roman_w_cs_times_new_roman_w_sz_w_val_22_w_lang_w_val_en_us_w_rpr_w_t_registered_w_t_w_r_w_r_w_rsidr_007c0711_w_rpr_w_rfonts_w_ascii_times_new_roman_w_hansi_times_new_roman_w_cs_times_new_roman_w_sz_w_val_22_w_rpr_w_t_w_t_w_r_w_r_w_rsidr_007c0711_w_rpr_w_rfonts_w_ascii_times_new_roman_w_hansi_times_new_roman_w_cs_times_new_roman_w_sz_w_val_22_w_lang_w_val_en_us_w_rpr_w_t_in_w_t_w_r_w_r_w_rsidr_007c0711_w_rsidrpr_007c0711_w_rpr_w_rfonts_w_ascii_times_new_roman_w_hansi_times_new_roman_w_cs_times_new_roman_w_sz_w_val_22_w_rpr_w_t_w_t_w_r_w_r_w_rsidr_007c0711_w_rpr_w_rfonts_w_ascii_times_new_roman_w_hansi_times_new_roman_w_cs_times_new_roman_w_sz_w_val_22_w_lang_w_val_en_us_w_rpr_w_t_flat_w_t_w_r_w_r_w_rsidr_007c0711_w_rsidrpr_007c0711_w_rpr_w_rfonts_w_ascii_times_new_roman_w_hansi_times_new_roman_w_cs_times_new_roman_w_sz_w_val_22_w_rpr_w_t_xml_space_preserve }}</w:t>
+      <w:r>
+        <w:rPr>
+          <w:rFonts w:ascii="Times New Roman" w:hAnsi="Times New Roman" w:cs="Times New Roman"/>
+          <w:sz w:val="22"/>
+        </w:rPr>
+        <w:t xml:space="preserve">{{ who_lives_and_is_registered_in_flat }}</w:t>
       </w:r>
       <w:r>
         <w:rPr>
@@ -806,12 +796,11 @@
         </w:rPr>
         <w:t xml:space="preserve">2.1.2. Одновременно с Квартирой передать Покупателю следующие документы и принадлежности: </w:t>
       </w:r>
-      <w:proofErr w:type="gramStart"/>
-      <w:r>
-        <w:rPr>
-          <w:rFonts w:ascii="Times New Roman" w:hAnsi="Times New Roman"/>
-        </w:rPr>
-        <w:t xml:space="preserve">{{ w_t_w_r_w_prooferr_w_type_spellstart_w_r_w_rsidr_009c6e38_w_rpr_w_rfonts_w_ascii_times_new_roman_w_hansi_times_new_roman_w_rpr_w_t_list_w_t_w_r_w_prooferr_w_type_gramend_w_r_w_rsidr_009c6e38_w_rsidrpr_009c6e38_w_rpr_w_rfonts_w_ascii_times_new_roman_w_hansi_times_new_roman_w_rpr_w_t_w_t_w_r_w_r_w_rsidr_009c6e38_w_rpr_w_rfonts_w_ascii_times_new_roman_w_hansi_times_new_roman_w_rpr_w_t_of_w_t_w_r_w_r_w_rsidr_009c6e38_w_rsidrpr_009c6e38_w_rpr_w_rfonts_w_ascii_times_new_roman_w_hansi_times_new_roman_w_rpr_w_t_w_t_w_r_w_r_w_rsidr_009c6e38_w_rpr_w_rfonts_w_ascii_times_new_roman_w_hansi_times_new_roman_w_rpr_w_t_submitted_w_t_w_r_w_r_w_rsidr_009c6e38_w_rsidrpr_009c6e38_w_rpr_w_rfonts_w_ascii_times_new_roman_w_hansi_times_new_roman_w_rpr_w_t_documents_w_t_w_r_w_prooferr_w_type_spellend_w_r_w_rsidr_009c6e38_w_rsidrpr_009c6e38_w_rpr_w_rfonts_w_ascii_times_new_roman_w_hansi_times_new_roman_w_rpr_w_t_xml_space_preserve }}</w:t>
+      <w:r>
+        <w:rPr>
+          <w:rFonts w:ascii="Times New Roman" w:hAnsi="Times New Roman"/>
+        </w:rPr>
+        <w:t xml:space="preserve">{{ list_of_submitted_documents }}</w:t>
       </w:r>
       <w:r>
         <w:rPr>
@@ -897,12 +886,11 @@
         </w:rPr>
         <w:t xml:space="preserve"> </w:t>
       </w:r>
-      <w:proofErr w:type="gramStart"/>
-      <w:r>
-        <w:rPr>
-          <w:rFonts w:ascii="Times New Roman" w:hAnsi="Times New Roman"/>
-        </w:rPr>
-        <w:t>{{ w_t_w_r_w_r_w_rsidr_00376ff5_w_rpr_w_rfonts_w_ascii_times_new_roman_w_hansi_times_new_roman_w_rpr_w_t_xml_space_preserve_deadline_w_t_w_r_w_prooferr_w_type_gramend_w_r_w_rsidr_00376ff5_w_rpr_w_rfonts_w_ascii_times_new_roman_w_hansi_times_new_roman_w_rpr_w_t_for_submitting_documents_to_the_rights_w_t_w_r_w_r_w_rsidr_00376ff5_w_rsidrpr_00376ff5_w_rpr_w_rfonts_w_ascii_times_new_roman_w_hansi_times_new_roman_w_rpr_w_t_registrat_w_t_w_r_w_r_w_rsidr_00376ff5_w_rpr_w_rfonts_w_ascii_times_new_roman_w_hansi_times_new_roman_w_rpr_w_t_ion_w_t_w_r_w_r_w_rsidr_00376ff5_w_rsidrpr_00376ff5_w_rpr_w_rfonts_w_ascii_times_new_roman_w_hansi_times_new_roman_w_rpr_w_t_authority_w_t_w_r_w_r_w_rsidr_00376ff5_w_rpr_w_rfonts_w_ascii_times_new_roman_w_hansi_times_new_roman_w_rpr_w_t_xml_space_preserve_w_t_w_r_w_r_w_rsidr_00376ff5_w_rsidrpr_00376ff5_w_rpr_w_rfonts_w_ascii_times_new_roman_w_hansi_times_new_roman_w_rpr_w_t }}</w:t>
+      <w:r>
+        <w:rPr>
+          <w:rFonts w:ascii="Times New Roman" w:hAnsi="Times New Roman"/>
+        </w:rPr>
+        <w:t>{{ deadline_for_submitting_documents_to_the_rights_registration_authority }}</w:t>
       </w:r>
       <w:r>
         <w:rPr>
@@ -981,12 +969,11 @@
         </w:rPr>
         <w:t xml:space="preserve">регистрации прав все необходимые документы для регистрации перехода права собственности на Квартиру к Покупателю в срок </w:t>
       </w:r>
-      <w:proofErr w:type="gramStart"/>
-      <w:r>
-        <w:rPr>
-          <w:rFonts w:ascii="Times New Roman" w:hAnsi="Times New Roman"/>
-        </w:rPr>
-        <w:t>{{ w_t_w_r_w_r_w_rsidr_00376ff5_w_rpr_w_rfonts_w_ascii_times_new_roman_w_hansi_times_new_roman_w_rpr_w_t_xml_space_preserve_deadline_w_t_w_r_w_prooferr_w_type_gramend_w_r_w_rsidr_00376ff5_w_rpr_w_rfonts_w_ascii_times_new_roman_w_hansi_times_new_roman_w_rpr_w_t_for_submitting_documents_to_the_rights_w_t_w_r_w_r_w_rsidr_00376ff5_w_rsidrpr_00376ff5_w_rpr_w_rfonts_w_ascii_times_new_roman_w_hansi_times_new_roman_w_rpr_w_t_registrat_w_t_w_r_w_r_w_rsidr_00376ff5_w_rpr_w_rfonts_w_ascii_times_new_roman_w_hansi_times_new_roman_w_rpr_w_t_ion_w_t_w_r_w_r_w_rsidr_00376ff5_w_rsidrpr_00376ff5_w_rpr_w_rfonts_w_ascii_times_new_roman_w_hansi_times_new_roman_w_rpr_w_t_authority_w_t_w_r_w_r_w_rsidr_00376ff5_w_rpr_w_rfonts_w_ascii_times_new_roman_w_hansi_times_new_roman_w_rpr_w_t_xml_space_preserve_w_t_w_r_w_r_w_rsidr_00376ff5_w_rsidrpr_00376ff5_w_rpr_w_rfonts_w_ascii_times_new_roman_w_hansi_times_new_roman_w_rpr_w_t }}</w:t>
+      <w:r>
+        <w:rPr>
+          <w:rFonts w:ascii="Times New Roman" w:hAnsi="Times New Roman"/>
+        </w:rPr>
+        <w:t>{{ deadline_for_submitting_documents_to_the_rights_registration_authority }}</w:t>
       </w:r>
       <w:r>
         <w:rPr>
@@ -1058,12 +1045,11 @@
         </w:rPr>
         <w:t xml:space="preserve">у в размере </w:t>
       </w:r>
-      <w:proofErr w:type="gramStart"/>
-      <w:r>
-        <w:rPr>
-          <w:rFonts w:ascii="Times New Roman" w:hAnsi="Times New Roman"/>
-        </w:rPr>
-        <w:t xml:space="preserve">{{ w_t_w_r_w_r_w_rsidr_00376ff5_w_rpr_w_rfonts_w_ascii_times_new_roman_w_hansi_times_new_roman_w_lang_w_val_en_us_w_rpr_w_t_flat_w_t_w_r_w_prooferr_w_type_gramend_w_r_w_rsidr_00376ff5_w_rsidrpr_00376ff5_w_rpr_w_rfonts_w_ascii_times_new_roman_w_hansi_times_new_roman_w_rpr_w_t_w_t_w_r_w_r_w_rsidr_00376ff5_w_rpr_w_rfonts_w_ascii_times_new_roman_w_hansi_times_new_roman_w_lang_w_val_en_us_w_rpr_w_t_price_w_t_w_r_w_r_w_rsidr_00376ff5_w_rsidrpr_00376ff5_w_rpr_w_rfonts_w_ascii_times_new_roman_w_hansi_times_new_roman_w_rpr_w_t_xml_space_preserve }}</w:t>
+      <w:r>
+        <w:rPr>
+          <w:rFonts w:ascii="Times New Roman" w:hAnsi="Times New Roman"/>
+        </w:rPr>
+        <w:t xml:space="preserve">{{ flat_price }}</w:t>
       </w:r>
       <w:r>
         <w:rPr>
@@ -1103,12 +1089,11 @@
         </w:rPr>
         <w:t xml:space="preserve">3.3. Перечисление денежных средств производится в полном объеме в течение </w:t>
       </w:r>
-      <w:proofErr w:type="gramStart"/>
-      <w:r>
-        <w:rPr>
-          <w:rFonts w:ascii="Times New Roman" w:hAnsi="Times New Roman"/>
-        </w:rPr>
-        <w:t xml:space="preserve">{{ w_t_w_r_w_prooferr_w_type_spellstart_w_r_w_rsidr_00376ff5_w_rpr_w_rfonts_w_ascii_times_new_roman_w_hansi_times_new_roman_w_rpr_w_t_num_w_t_w_r_w_prooferr_w_type_gramend_w_r_w_rsidr_00376ff5_w_rsidrpr_00376ff5_w_rpr_w_rfonts_w_ascii_times_new_roman_w_hansi_times_new_roman_w_rpr_w_t_w_t_w_r_w_r_w_rsidr_00376ff5_w_rpr_w_rfonts_w_ascii_times_new_roman_w_hansi_times_new_roman_w_rpr_w_t_of_w_t_w_r_w_r_w_rsidr_00376ff5_w_rsidrpr_00376ff5_w_rpr_w_rfonts_w_ascii_times_new_roman_w_hansi_times_new_roman_w_rpr_w_t_w_t_w_r_w_r_w_rsidr_00376ff5_w_rpr_w_rfonts_w_ascii_times_new_roman_w_hansi_times_new_roman_w_rpr_w_t_days_w_t_w_r_w_r_w_rsidr_00376ff5_w_rsidrpr_00376ff5_w_rpr_w_rfonts_w_ascii_times_new_roman_w_hansi_times_new_roman_w_rpr_w_t_w_t_w_r_w_r_w_rsidr_00376ff5_w_rpr_w_rfonts_w_ascii_times_new_roman_w_hansi_times_new_roman_w_rpr_w_t_to_w_t_w_r_w_r_w_rsidr_00376ff5_w_rsidrpr_00376ff5_w_rpr_w_rfonts_w_ascii_times_new_roman_w_hansi_times_new_roman_w_rpr_w_t_w_t_w_r_w_r_w_rsidr_00376ff5_w_rpr_w_rfonts_w_ascii_times_new_roman_w_hansi_times_new_roman_w_rpr_w_t_transfer_w_t_w_r_w_r_w_rsidr_00376ff5_w_rsidrpr_00376ff5_w_rpr_w_rfonts_w_ascii_times_new_roman_w_hansi_times_new_roman_w_rpr_w_t_money_w_t_w_r_w_prooferr_w_type_spellend_w_r_w_rsidr_00376ff5_w_rsidrpr_00376ff5_w_rpr_w_rfonts_w_ascii_times_new_roman_w_hansi_times_new_roman_w_rpr_w_t_xml_space_preserve }}</w:t>
+      <w:r>
+        <w:rPr>
+          <w:rFonts w:ascii="Times New Roman" w:hAnsi="Times New Roman"/>
+        </w:rPr>
+        <w:t xml:space="preserve">{{ num_of_days_to_transfer_money }}</w:t>
       </w:r>
       <w:r>
         <w:rPr>
@@ -1237,12 +1222,11 @@
         </w:rPr>
         <w:t xml:space="preserve">ода права собственности в </w:t>
       </w:r>
-      <w:proofErr w:type="gramStart"/>
-      <w:r>
-        <w:rPr>
-          <w:rFonts w:ascii="Times New Roman" w:hAnsi="Times New Roman"/>
-        </w:rPr>
-        <w:t xml:space="preserve">{{ w_t_w_r_w_prooferr_w_type_spellstart_w_r_w_rsidr_00722f85_w_rpr_w_rfonts_w_ascii_times_new_roman_w_hansi_times_new_roman_w_rpr_w_t_name_w_t_w_r_w_prooferr_w_type_gramend_w_r_w_rsidr_00722f85_w_rsidrpr_00722f85_w_rpr_w_rfonts_w_ascii_times_new_roman_w_hansi_times_new_roman_w_rpr_w_t_w_t_w_r_w_r_w_rsidr_00722f85_w_rpr_w_rfonts_w_ascii_times_new_roman_w_hansi_times_new_roman_w_rpr_w_t_of_w_t_w_r_w_r_w_rsidr_00722f85_w_rsidrpr_00722f85_w_rpr_w_rfonts_w_ascii_times_new_roman_w_hansi_times_new_roman_w_rpr_w_t_w_t_w_r_w_r_w_rsidr_00722f85_w_rpr_w_rfonts_w_ascii_times_new_roman_w_hansi_times_new_roman_w_rpr_w_t_the_w_t_w_r_w_r_w_rsidr_00722f85_w_rsidrpr_00722f85_w_rpr_w_rfonts_w_ascii_times_new_roman_w_hansi_times_new_roman_w_rpr_w_t_w_t_w_r_w_r_w_rsidr_00722f85_w_rpr_w_rfonts_w_ascii_times_new_roman_w_hansi_times_new_roman_w_rpr_w_t_rights_w_t_w_r_w_r_w_rsidr_00722f85_w_rsidrpr_00722f85_w_rpr_w_rfonts_w_ascii_times_new_roman_w_hansi_times_new_roman_w_rpr_w_t_w_t_w_r_w_r_w_rsidr_00722f85_w_rpr_w_rfonts_w_ascii_times_new_roman_w_hansi_times_new_roman_w_rpr_w_t_registration_w_t_w_r_w_r_w_rsidr_00722f85_w_rsidrpr_00722f85_w_rpr_w_rfonts_w_ascii_times_new_roman_w_hansi_times_new_roman_w_rpr_w_t_authority_w_t_w_r_w_prooferr_w_type_spellend_w_r_w_rsidr_00722f85_w_rsidrpr_00722f85_w_rpr_w_rfonts_w_ascii_times_new_roman_w_hansi_times_new_roman_w_rpr_w_t_xml_space_preserve }}</w:t>
+      <w:r>
+        <w:rPr>
+          <w:rFonts w:ascii="Times New Roman" w:hAnsi="Times New Roman"/>
+        </w:rPr>
+        <w:t xml:space="preserve">{{ name_of_the_rights_registration_authority }}</w:t>
       </w:r>
       <w:r>
         <w:rPr>
@@ -1273,12 +1257,11 @@
         </w:rPr>
         <w:t xml:space="preserve"> </w:t>
       </w:r>
-      <w:proofErr w:type="gramStart"/>
-      <w:r>
-        <w:rPr>
-          <w:rFonts w:ascii="Times New Roman" w:hAnsi="Times New Roman"/>
-        </w:rPr>
-        <w:t>{{ w_t_w_r_w_r_w_rpr_w_rfonts_w_ascii_times_new_roman_w_hansi_times_new_roman_w_rpr_w_t_xml_space_preserve_w_t_w_r_w_prooferr_w_type_spellstart_w_r_w_rsidr_00722f85_w_rpr_w_rfonts_w_ascii_times_new_roman_w_hansi_times_new_roman_w_rpr_w_t_who_w_t_w_r_w_prooferr_w_type_gramend_w_r_w_rsidr_00722f85_w_rsidrpr_00722f85_w_rpr_w_rfonts_w_ascii_times_new_roman_w_hansi_times_new_roman_w_rpr_w_t_w_t_w_r_w_r_w_rsidr_00722f85_w_rpr_w_rfonts_w_ascii_times_new_roman_w_hansi_times_new_roman_w_rpr_w_t_pays_w_t_w_r_w_r_w_rsidr_00722f85_w_rsidrpr_00722f85_w_rpr_w_rfonts_w_ascii_times_new_roman_w_hansi_times_new_roman_w_rpr_w_t_w_t_w_r_w_r_w_rsidr_00722f85_w_rpr_w_rfonts_w_ascii_times_new_roman_w_hansi_times_new_roman_w_rpr_w_t_the_w_t_w_r_w_r_w_rsidr_00722f85_w_rsidrpr_00722f85_w_rpr_w_rfonts_w_ascii_times_new_roman_w_hansi_times_new_roman_w_rpr_w_t_expenses_w_t_w_r_w_prooferr_w_type_spellend_w_r_w_rsidr_00722f85_w_rpr_w_rfonts_w_ascii_times_new_roman_w_hansi_times_new_roman_w_rpr_w_t_xml_space_preserve_w_t_w_r_w_r_w_rsidr_00722f85_w_rsidrpr_00722f85_w_rpr_w_rfonts_w_ascii_times_new_roman_w_hansi_times_new_roman_w_rpr_w_t }}</w:t>
+      <w:r>
+        <w:rPr>
+          <w:rFonts w:ascii="Times New Roman" w:hAnsi="Times New Roman"/>
+        </w:rPr>
+        <w:t>{{ who_pays_the_expenses }}</w:t>
       </w:r>
       <w:r>
         <w:rPr>
@@ -1392,13 +1375,12 @@
         </w:rPr>
         <w:t xml:space="preserve">считает, что ее права нарушены, обязана направить другой Стороне письменную претензию следующим способом: </w:t>
       </w:r>
-      <w:proofErr w:type="gramStart"/>
-      <w:r>
-        <w:rPr>
-          <w:rFonts w:ascii="Times New Roman" w:hAnsi="Times New Roman" w:cs="Times New Roman"/>
-          <w:sz w:val="22"/>
-        </w:rPr>
-        <w:t xml:space="preserve">{{ w_t_w_r_w_prooferr_w_type_spellstart_w_r_w_rsidr_009045ba_w_rpr_w_rfonts_w_ascii_times_new_roman_w_hansi_times_new_roman_w_cs_times_new_roman_w_sz_w_val_22_w_rpr_w_t_method_w_t_w_r_w_prooferr_w_type_gramend_w_r_w_rsidr_009045ba_w_rsidrpr_009045ba_w_rpr_w_rfonts_w_ascii_times_new_roman_w_hansi_times_new_roman_w_cs_times_new_roman_w_sz_w_val_22_w_rpr_w_t_w_t_w_r_w_r_w_rsidr_009045ba_w_rpr_w_rfonts_w_ascii_times_new_roman_w_hansi_times_new_roman_w_cs_times_new_roman_w_sz_w_val_22_w_rpr_w_t_of_w_t_w_r_w_r_w_rsidr_009045ba_w_rsidrpr_009045ba_w_rpr_w_rfonts_w_ascii_times_new_roman_w_hansi_times_new_roman_w_cs_times_new_roman_w_sz_w_val_22_w_rpr_w_t_w_t_w_r_w_r_w_rsidr_009045ba_w_rpr_w_rfonts_w_ascii_times_new_roman_w_hansi_times_new_roman_w_cs_times_new_roman_w_sz_w_val_22_w_rpr_w_t_sending_w_t_w_r_w_r_w_rsidr_009045ba_w_rsidrpr_009045ba_w_rpr_w_rfonts_w_ascii_times_new_roman_w_hansi_times_new_roman_w_cs_times_new_roman_w_sz_w_val_22_w_rpr_w_t_w_t_w_r_w_r_w_rsidr_009045ba_w_rpr_w_rfonts_w_ascii_times_new_roman_w_hansi_times_new_roman_w_cs_times_new_roman_w_sz_w_val_22_w_rpr_w_t_the_w_t_w_r_w_r_w_rsidr_009045ba_w_rsidrpr_009045ba_w_rpr_w_rfonts_w_ascii_times_new_roman_w_hansi_times_new_roman_w_cs_times_new_roman_w_sz_w_val_22_w_rpr_w_t_claim_w_t_w_r_w_prooferr_w_type_spellend_w_r_w_rsidr_009045ba_w_rsidrpr_009045ba_w_rpr_w_rfonts_w_ascii_times_new_roman_w_hansi_times_new_roman_w_cs_times_new_roman_w_sz_w_val_22_w_rpr_w_t_xml_space_preserve }}</w:t>
+      <w:r>
+        <w:rPr>
+          <w:rFonts w:ascii="Times New Roman" w:hAnsi="Times New Roman" w:cs="Times New Roman"/>
+          <w:sz w:val="22"/>
+        </w:rPr>
+        <w:t xml:space="preserve">{{ method_of_sending_the_claim }}</w:t>
       </w:r>
       <w:r>
         <w:rPr>
@@ -1432,13 +1414,12 @@
         </w:rPr>
         <w:t xml:space="preserve">5.1.2. Сторона, получившая претензию, обязана рассмотреть ее и направить письменный мотивированный ответ в течение </w:t>
       </w:r>
-      <w:proofErr w:type="gramStart"/>
-      <w:r>
-        <w:rPr>
-          <w:rFonts w:ascii="Times New Roman" w:hAnsi="Times New Roman" w:cs="Times New Roman"/>
-          <w:sz w:val="22"/>
-        </w:rPr>
-        <w:t xml:space="preserve">{{ w_t_w_r_w_prooferr_w_type_spellstart_w_r_w_rsidr_009045ba_w_rpr_w_rfonts_w_ascii_times_new_roman_w_hansi_times_new_roman_w_cs_times_new_roman_w_sz_w_val_22_w_rpr_w_t_num_w_t_w_r_w_prooferr_w_type_gramend_w_r_w_rsidr_009045ba_w_rsidrpr_009045ba_w_rpr_w_rfonts_w_ascii_times_new_roman_w_hansi_times_new_roman_w_cs_times_new_roman_w_sz_w_val_22_w_rpr_w_t_w_t_w_r_w_r_w_rsidr_009045ba_w_rpr_w_rfonts_w_ascii_times_new_roman_w_hansi_times_new_roman_w_cs_times_new_roman_w_sz_w_val_22_w_rpr_w_t_of_w_t_w_r_w_r_w_rsidr_009045ba_w_rsidrpr_009045ba_w_rpr_w_rfonts_w_ascii_times_new_roman_w_hansi_times_new_roman_w_cs_times_new_roman_w_sz_w_val_22_w_rpr_w_t_w_t_w_r_w_r_w_rsidr_009045ba_w_rpr_w_rfonts_w_ascii_times_new_roman_w_hansi_times_new_roman_w_cs_times_new_roman_w_sz_w_val_22_w_rpr_w_t_days_w_t_w_r_w_r_w_rsidr_009045ba_w_rsidrpr_009045ba_w_rpr_w_rfonts_w_ascii_times_new_roman_w_hansi_times_new_roman_w_cs_times_new_roman_w_sz_w_val_22_w_rpr_w_t_w_t_w_r_w_r_w_rsidr_009045ba_w_rpr_w_rfonts_w_ascii_times_new_roman_w_hansi_times_new_roman_w_cs_times_new_roman_w_sz_w_val_22_w_rpr_w_t_of_w_t_w_r_w_r_w_rsidr_009045ba_w_rsidrpr_009045ba_w_rpr_w_rfonts_w_ascii_times_new_roman_w_hansi_times_new_roman_w_cs_times_new_roman_w_sz_w_val_22_w_rpr_w_t_w_t_w_r_w_r_w_rsidr_009045ba_w_rpr_w_rfonts_w_ascii_times_new_roman_w_hansi_times_new_roman_w_cs_times_new_roman_w_sz_w_val_22_w_rpr_w_t_response_w_t_w_r_w_r_w_rsidr_009045ba_w_rsidrpr_009045ba_w_rpr_w_rfonts_w_ascii_times_new_roman_w_hansi_times_new_roman_w_cs_times_new_roman_w_sz_w_val_22_w_rpr_w_t_to_w_t_w_r_w_r_w_rsidr_009045ba_w_rpr_w_rfonts_w_ascii_times_new_roman_w_hansi_times_new_roman_w_cs_times_new_roman_w_sz_w_val_22_w_rpr_w_t_the_w_t_w_r_w_r_w_rsidr_009045ba_w_rsidrpr_009045ba_w_rpr_w_rfonts_w_ascii_times_new_roman_w_hansi_times_new_roman_w_cs_times_new_roman_w_sz_w_val_22_w_rpr_w_t_claim_w_t_w_r_w_prooferr_w_type_spellend_w_r_w_rpr_w_rfonts_w_ascii_times_new_roman_w_hansi_times_new_roman_w_cs_times_new_roman_w_sz_w_val_22_w_rpr_w_t_xml_space_preserve_w_t_w_r_w_r_w_rsidr_009045ba_w_rsidrpr_009045ba_w_rpr_w_rfonts_w_ascii_times_new_roman_w_hansi_times_new_roman_w_cs_times_new_roman_w_sz_w_val_22_w_rpr_w_t_xml_space_preserve }} </w:t>
+      <w:r>
+        <w:rPr>
+          <w:rFonts w:ascii="Times New Roman" w:hAnsi="Times New Roman" w:cs="Times New Roman"/>
+          <w:sz w:val="22"/>
+        </w:rPr>
+        <w:t xml:space="preserve">{{ num_of_days_of_response_to_the_claim }} </w:t>
       </w:r>
       <w:r>
         <w:rPr>
@@ -1646,13 +1627,12 @@
         </w:rPr>
         <w:t xml:space="preserve">8.1. Стороны обязуются письменно извещать друг друга об изменении реквизитов и адресов в срок </w:t>
       </w:r>
-      <w:proofErr w:type="gramStart"/>
-      <w:r>
-        <w:rPr>
-          <w:rFonts w:ascii="Times New Roman" w:hAnsi="Times New Roman" w:cs="Times New Roman"/>
-          <w:sz w:val="22"/>
-        </w:rPr>
-        <w:t xml:space="preserve">{{ w_t_w_r_w_prooferr_w_type_spellstart_w_r_w_rsidr_002f59da_w_rpr_w_rfonts_w_ascii_times_new_roman_w_hansi_times_new_roman_w_cs_times_new_roman_w_sz_w_val_22_w_rpr_w_t_deadline_w_t_w_r_w_prooferr_w_type_gramend_w_r_w_rsidr_002f59da_w_rsidrpr_002f59da_w_rpr_w_rfonts_w_ascii_times_new_roman_w_hansi_times_new_roman_w_cs_times_new_roman_w_sz_w_val_22_w_rpr_w_t_w_t_w_r_w_r_w_rsidr_002f59da_w_rpr_w_rfonts_w_ascii_times_new_roman_w_hansi_times_new_roman_w_cs_times_new_roman_w_sz_w_val_22_w_rpr_w_t_for_w_t_w_r_w_r_w_rsidr_002f59da_w_rsidrpr_002f59da_w_rpr_w_rfonts_w_ascii_times_new_roman_w_hansi_times_new_roman_w_cs_times_new_roman_w_sz_w_val_22_w_rpr_w_t_w_t_w_r_w_r_w_rsidr_002f59da_w_rpr_w_rfonts_w_ascii_times_new_roman_w_hansi_times_new_roman_w_cs_times_new_roman_w_sz_w_val_22_w_rpr_w_t_notification_w_t_w_r_w_r_w_rsidr_002f59da_w_rsidrpr_002f59da_w_rpr_w_rfonts_w_ascii_times_new_roman_w_hansi_times_new_roman_w_cs_times_new_roman_w_sz_w_val_22_w_rpr_w_t_w_t_w_r_w_r_w_rsidr_002f59da_w_rpr_w_rfonts_w_ascii_times_new_roman_w_hansi_times_new_roman_w_cs_times_new_roman_w_sz_w_val_22_w_rpr_w_t_of_w_t_w_r_w_r_w_rsidr_002f59da_w_rsidrpr_002f59da_w_rpr_w_rfonts_w_ascii_times_new_roman_w_hansi_times_new_roman_w_cs_times_new_roman_w_sz_w_val_22_w_rpr_w_t_changes_w_t_w_r_w_prooferr_w_type_spellend_w_r_w_rsidr_002f59da_w_rpr_w_rfonts_w_ascii_times_new_roman_w_hansi_times_new_roman_w_cs_times_new_roman_w_sz_w_val_22_w_rpr_w_t_xml_space_preserve_w_t_w_r_w_r_w_rsidr_002f59da_w_rsidrpr_002f59da_w_rpr_w_rfonts_w_ascii_times_new_roman_w_hansi_times_new_roman_w_cs_times_new_roman_w_sz_w_val_22_w_rpr_w_t }}</w:t>
+      <w:r>
+        <w:rPr>
+          <w:rFonts w:ascii="Times New Roman" w:hAnsi="Times New Roman" w:cs="Times New Roman"/>
+          <w:sz w:val="22"/>
+        </w:rPr>
+        <w:t xml:space="preserve">{{ deadline_for_notification_of_changes }}</w:t>
       </w:r>
       <w:r>
         <w:rPr>
@@ -1797,7 +1777,6 @@
         </w:rPr>
         <w:t>{</w:t>
       </w:r>
-      <w:proofErr w:type="gramStart"/>
       <w:r>
         <w:rPr>
           <w:rFonts w:ascii="Times New Roman" w:hAnsi="Times New Roman"/>
@@ -1805,7 +1784,6 @@
         </w:rPr>
         <w:t xml:space="preserve">{ </w:t>
       </w:r>
-      <w:proofErr w:type="spellStart"/>
       <w:r>
         <w:rPr>
           <w:rFonts w:ascii="Times New Roman" w:hAnsi="Times New Roman"/>
@@ -1813,7 +1791,6 @@
         </w:rPr>
         <w:t>full</w:t>
       </w:r>
-      <w:proofErr w:type="gramEnd"/>
       <w:r>
         <w:rPr>
           <w:rFonts w:ascii="Times New Roman" w:hAnsi="Times New Roman"/>
@@ -1828,7 +1805,6 @@
         </w:rPr>
         <w:t>seller</w:t>
       </w:r>
-      <w:proofErr w:type="spellEnd"/>
       <w:r>
         <w:rPr>
           <w:rFonts w:ascii="Times New Roman" w:hAnsi="Times New Roman"/>
@@ -1880,7 +1856,6 @@
         </w:rPr>
         <w:t>{</w:t>
       </w:r>
-      <w:proofErr w:type="gramStart"/>
       <w:r>
         <w:rPr>
           <w:rFonts w:ascii="Times New Roman" w:hAnsi="Times New Roman"/>
@@ -1888,7 +1863,6 @@
         </w:rPr>
         <w:t xml:space="preserve">{ </w:t>
       </w:r>
-      <w:proofErr w:type="spellStart"/>
       <w:r>
         <w:rPr>
           <w:rFonts w:ascii="Times New Roman" w:hAnsi="Times New Roman"/>
@@ -1896,7 +1870,6 @@
         </w:rPr>
         <w:t>full</w:t>
       </w:r>
-      <w:proofErr w:type="gramEnd"/>
       <w:r>
         <w:rPr>
           <w:rFonts w:ascii="Times New Roman" w:hAnsi="Times New Roman"/>
@@ -1904,7 +1877,6 @@
         </w:rPr>
         <w:t>_name_of_the_buyer</w:t>
       </w:r>
-      <w:proofErr w:type="spellEnd"/>
       <w:r>
         <w:rPr>
           <w:rFonts w:ascii="Times New Roman" w:hAnsi="Times New Roman"/>

</xml_diff>